<commit_message>
Asesmen Bersama: tab Rekap Nilai semua mapel (versi pertama)
Per siswa x mapel (nilai/TH/BL/JD, susulan), per mapel, rata-rata per kelas,
batas tuntas, Excel 3 lembar; panduan diperbarui.

Co-Authored-By: Claude Opus 5.5 <noreply@anthropic.com>
</commit_message>
<xml_diff>
--- a/Panduan_Asesmen_Bersama.docx
+++ b/Panduan_Asesmen_Bersama.docx
@@ -477,7 +477,21 @@
           <w:bCs w:val="false"/>
           <w:color w:val="33445A"/>
         </w:rPr>
-        <w:t xml:space="preserve">5.2 Hasil Siswa</w:t>
+        <w:t xml:space="preserve">5.2 Rekap Nilai</w:t>
+      </w:r>
+    </w:p>
+    <w:p>
+      <w:pPr>
+        <w:spacing w:after="50" w:before="0"/>
+        <w:ind w:left="360"/>
+      </w:pPr>
+      <w:r>
+        <w:rPr>
+          <w:b w:val="false"/>
+          <w:bCs w:val="false"/>
+          <w:color w:val="33445A"/>
+        </w:rPr>
+        <w:t xml:space="preserve">5.3 Hasil Siswa</w:t>
       </w:r>
     </w:p>
     <w:p>
@@ -5646,7 +5660,594 @@
         <w:pStyle w:val="Heading2"/>
       </w:pPr>
       <w:r>
-        <w:t xml:space="preserve">5.2 Hasil Siswa</w:t>
+        <w:t xml:space="preserve">5.2 Rekap Nilai</w:t>
+      </w:r>
+    </w:p>
+    <w:p>
+      <w:pPr>
+        <w:spacing w:after="120"/>
+      </w:pPr>
+      <w:r>
+        <w:t xml:space="preserve">Tab </w:t>
+      </w:r>
+      <w:r>
+        <w:rPr>
+          <w:b/>
+          <w:bCs/>
+        </w:rPr>
+        <w:t xml:space="preserve">Rekap Nilai</w:t>
+      </w:r>
+      <w:r>
+        <w:t xml:space="preserve"> mengumpulkan nilai </w:t>
+      </w:r>
+      <w:r>
+        <w:rPr>
+          <w:b/>
+          <w:bCs/>
+        </w:rPr>
+        <w:t xml:space="preserve">semua mapel</w:t>
+      </w:r>
+      <w:r>
+        <w:t xml:space="preserve"> dalam satu tabel: satu baris per siswa, satu kolom per mapel. Hanya hasil dari sesi asesmen ini (termasuk susulan) yang dihitung; nilai latihan atau tryout lain yang kebetulan memakai paket sama tidak ikut.</w:t>
+      </w:r>
+    </w:p>
+    <w:tbl>
+      <w:tblPr>
+        <w:tblW w:type="dxa" w:w="9638"/>
+        <w:tblBorders>
+          <w:top w:val="single" w:color="D5DCE6" w:sz="4"/>
+          <w:left w:val="none" w:color="FFFFFF" w:sz="0"/>
+          <w:bottom w:val="single" w:color="D5DCE6" w:sz="4"/>
+          <w:right w:val="none" w:color="FFFFFF" w:sz="0"/>
+          <w:insideH w:val="single" w:color="D5DCE6" w:sz="4"/>
+          <w:insideV w:val="none" w:color="FFFFFF" w:sz="0"/>
+        </w:tblBorders>
+      </w:tblPr>
+      <w:tblGrid>
+        <w:gridCol w:w="2754"/>
+        <w:gridCol w:w="6884"/>
+      </w:tblGrid>
+      <w:tr>
+        <w:trPr>
+          <w:cantSplit/>
+          <w:tblHeader/>
+        </w:trPr>
+        <w:tc>
+          <w:tcPr>
+            <w:tcW w:type="dxa" w:w="2754"/>
+            <w:shd w:fill="1D2A3A" w:color="auto" w:val="clear"/>
+            <w:tcMar>
+              <w:top w:type="dxa" w:w="70"/>
+              <w:left w:type="dxa" w:w="110"/>
+              <w:bottom w:type="dxa" w:w="70"/>
+              <w:right w:type="dxa" w:w="110"/>
+            </w:tcMar>
+          </w:tcPr>
+          <w:p>
+            <w:pPr>
+              <w:spacing w:after="0"/>
+            </w:pPr>
+            <w:r>
+              <w:rPr>
+                <w:b/>
+                <w:bCs/>
+                <w:color w:val="FFFFFF"/>
+                <w:sz w:val="19"/>
+                <w:szCs w:val="19"/>
+              </w:rPr>
+              <w:t xml:space="preserve">Bagian</w:t>
+            </w:r>
+          </w:p>
+        </w:tc>
+        <w:tc>
+          <w:tcPr>
+            <w:tcW w:type="dxa" w:w="6884"/>
+            <w:shd w:fill="1D2A3A" w:color="auto" w:val="clear"/>
+            <w:tcMar>
+              <w:top w:type="dxa" w:w="70"/>
+              <w:left w:type="dxa" w:w="110"/>
+              <w:bottom w:type="dxa" w:w="70"/>
+              <w:right w:type="dxa" w:w="110"/>
+            </w:tcMar>
+          </w:tcPr>
+          <w:p>
+            <w:pPr>
+              <w:spacing w:after="0"/>
+            </w:pPr>
+            <w:r>
+              <w:rPr>
+                <w:b/>
+                <w:bCs/>
+                <w:color w:val="FFFFFF"/>
+                <w:sz w:val="19"/>
+                <w:szCs w:val="19"/>
+              </w:rPr>
+              <w:t xml:space="preserve">Isi</w:t>
+            </w:r>
+          </w:p>
+        </w:tc>
+      </w:tr>
+      <w:tr>
+        <w:trPr>
+          <w:cantSplit/>
+        </w:trPr>
+        <w:tc>
+          <w:tcPr>
+            <w:tcW w:type="dxa" w:w="2754"/>
+            <w:tcMar>
+              <w:top w:type="dxa" w:w="70"/>
+              <w:left w:type="dxa" w:w="110"/>
+              <w:bottom w:type="dxa" w:w="70"/>
+              <w:right w:type="dxa" w:w="110"/>
+            </w:tcMar>
+          </w:tcPr>
+          <w:p>
+            <w:pPr>
+              <w:spacing w:after="0"/>
+            </w:pPr>
+            <w:r>
+              <w:rPr>
+                <w:b/>
+                <w:bCs/>
+                <w:sz w:val="19"/>
+                <w:szCs w:val="19"/>
+              </w:rPr>
+              <w:t xml:space="preserve">Kelas · Batas tuntas · Cari siswa</w:t>
+            </w:r>
+          </w:p>
+        </w:tc>
+        <w:tc>
+          <w:tcPr>
+            <w:tcW w:type="dxa" w:w="6884"/>
+            <w:tcMar>
+              <w:top w:type="dxa" w:w="70"/>
+              <w:left w:type="dxa" w:w="110"/>
+              <w:bottom w:type="dxa" w:w="70"/>
+              <w:right w:type="dxa" w:w="110"/>
+            </w:tcMar>
+          </w:tcPr>
+          <w:p>
+            <w:pPr>
+              <w:spacing w:after="0"/>
+            </w:pPr>
+            <w:r>
+              <w:rPr>
+                <w:sz w:val="19"/>
+                <w:szCs w:val="19"/>
+              </w:rPr>
+              <w:t xml:space="preserve">Menyaring tabel. Batas tuntas (bawaan 75) hanya untuk pewarnaan dan hitungan *di bawah batas*; diingat di perangkat ini.</w:t>
+            </w:r>
+          </w:p>
+        </w:tc>
+      </w:tr>
+      <w:tr>
+        <w:trPr>
+          <w:cantSplit/>
+        </w:trPr>
+        <w:tc>
+          <w:tcPr>
+            <w:tcW w:type="dxa" w:w="2754"/>
+            <w:shd w:fill="F6F8FB" w:color="auto" w:val="clear"/>
+            <w:tcMar>
+              <w:top w:type="dxa" w:w="70"/>
+              <w:left w:type="dxa" w:w="110"/>
+              <w:bottom w:type="dxa" w:w="70"/>
+              <w:right w:type="dxa" w:w="110"/>
+            </w:tcMar>
+          </w:tcPr>
+          <w:p>
+            <w:pPr>
+              <w:spacing w:after="0"/>
+            </w:pPr>
+            <w:r>
+              <w:rPr>
+                <w:b/>
+                <w:bCs/>
+                <w:sz w:val="19"/>
+                <w:szCs w:val="19"/>
+              </w:rPr>
+              <w:t xml:space="preserve">Kotak angka</w:t>
+            </w:r>
+          </w:p>
+        </w:tc>
+        <w:tc>
+          <w:tcPr>
+            <w:tcW w:type="dxa" w:w="6884"/>
+            <w:shd w:fill="F6F8FB" w:color="auto" w:val="clear"/>
+            <w:tcMar>
+              <w:top w:type="dxa" w:w="70"/>
+              <w:left w:type="dxa" w:w="110"/>
+              <w:bottom w:type="dxa" w:w="70"/>
+              <w:right w:type="dxa" w:w="110"/>
+            </w:tcMar>
+          </w:tcPr>
+          <w:p>
+            <w:pPr>
+              <w:spacing w:after="0"/>
+            </w:pPr>
+            <w:r>
+              <w:rPr>
+                <w:sz w:val="19"/>
+                <w:szCs w:val="19"/>
+              </w:rPr>
+              <w:t xml:space="preserve">Peserta, nilai yang sudah masuk dari seluruh sel, rata-rata semua nilai, jumlah di bawah batas, belum mengerjakan, tidak hadir, masih terjadwal.</w:t>
+            </w:r>
+          </w:p>
+        </w:tc>
+      </w:tr>
+      <w:tr>
+        <w:trPr>
+          <w:cantSplit/>
+        </w:trPr>
+        <w:tc>
+          <w:tcPr>
+            <w:tcW w:type="dxa" w:w="2754"/>
+            <w:tcMar>
+              <w:top w:type="dxa" w:w="70"/>
+              <w:left w:type="dxa" w:w="110"/>
+              <w:bottom w:type="dxa" w:w="70"/>
+              <w:right w:type="dxa" w:w="110"/>
+            </w:tcMar>
+          </w:tcPr>
+          <w:p>
+            <w:pPr>
+              <w:spacing w:after="0"/>
+            </w:pPr>
+            <w:r>
+              <w:rPr>
+                <w:b/>
+                <w:bCs/>
+                <w:sz w:val="19"/>
+                <w:szCs w:val="19"/>
+              </w:rPr>
+              <w:t xml:space="preserve">Per mapel</w:t>
+            </w:r>
+          </w:p>
+        </w:tc>
+        <w:tc>
+          <w:tcPr>
+            <w:tcW w:type="dxa" w:w="6884"/>
+            <w:tcMar>
+              <w:top w:type="dxa" w:w="70"/>
+              <w:left w:type="dxa" w:w="110"/>
+              <w:bottom w:type="dxa" w:w="70"/>
+              <w:right w:type="dxa" w:w="110"/>
+            </w:tcMar>
+          </w:tcPr>
+          <w:p>
+            <w:pPr>
+              <w:spacing w:after="0"/>
+            </w:pPr>
+            <w:r>
+              <w:rPr>
+                <w:sz w:val="19"/>
+                <w:szCs w:val="19"/>
+              </w:rPr>
+              <w:t xml:space="preserve">Peserta, sudah/belum/tidak hadir/terjadwal, rata-rata, tertinggi, terendah, dan jumlah di bawah batas per mapel.</w:t>
+            </w:r>
+          </w:p>
+        </w:tc>
+      </w:tr>
+      <w:tr>
+        <w:trPr>
+          <w:cantSplit/>
+        </w:trPr>
+        <w:tc>
+          <w:tcPr>
+            <w:tcW w:type="dxa" w:w="2754"/>
+            <w:shd w:fill="F6F8FB" w:color="auto" w:val="clear"/>
+            <w:tcMar>
+              <w:top w:type="dxa" w:w="70"/>
+              <w:left w:type="dxa" w:w="110"/>
+              <w:bottom w:type="dxa" w:w="70"/>
+              <w:right w:type="dxa" w:w="110"/>
+            </w:tcMar>
+          </w:tcPr>
+          <w:p>
+            <w:pPr>
+              <w:spacing w:after="0"/>
+            </w:pPr>
+            <w:r>
+              <w:rPr>
+                <w:b/>
+                <w:bCs/>
+                <w:sz w:val="19"/>
+                <w:szCs w:val="19"/>
+              </w:rPr>
+              <w:t xml:space="preserve">Rata-rata per kelas</w:t>
+            </w:r>
+          </w:p>
+        </w:tc>
+        <w:tc>
+          <w:tcPr>
+            <w:tcW w:type="dxa" w:w="6884"/>
+            <w:shd w:fill="F6F8FB" w:color="auto" w:val="clear"/>
+            <w:tcMar>
+              <w:top w:type="dxa" w:w="70"/>
+              <w:left w:type="dxa" w:w="110"/>
+              <w:bottom w:type="dxa" w:w="70"/>
+              <w:right w:type="dxa" w:w="110"/>
+            </w:tcMar>
+          </w:tcPr>
+          <w:p>
+            <w:pPr>
+              <w:spacing w:after="0"/>
+            </w:pPr>
+            <w:r>
+              <w:rPr>
+                <w:sz w:val="19"/>
+                <w:szCs w:val="19"/>
+              </w:rPr>
+              <w:t xml:space="preserve">Rata-rata tiap mapel per kelas dan rata-rata keseluruhan, untuk membandingkan kelas.</w:t>
+            </w:r>
+          </w:p>
+        </w:tc>
+      </w:tr>
+      <w:tr>
+        <w:trPr>
+          <w:cantSplit/>
+        </w:trPr>
+        <w:tc>
+          <w:tcPr>
+            <w:tcW w:type="dxa" w:w="2754"/>
+            <w:tcMar>
+              <w:top w:type="dxa" w:w="70"/>
+              <w:left w:type="dxa" w:w="110"/>
+              <w:bottom w:type="dxa" w:w="70"/>
+              <w:right w:type="dxa" w:w="110"/>
+            </w:tcMar>
+          </w:tcPr>
+          <w:p>
+            <w:pPr>
+              <w:spacing w:after="0"/>
+            </w:pPr>
+            <w:r>
+              <w:rPr>
+                <w:b/>
+                <w:bCs/>
+                <w:sz w:val="19"/>
+                <w:szCs w:val="19"/>
+              </w:rPr>
+              <w:t xml:space="preserve">Nilai per siswa</w:t>
+            </w:r>
+          </w:p>
+        </w:tc>
+        <w:tc>
+          <w:tcPr>
+            <w:tcW w:type="dxa" w:w="6884"/>
+            <w:tcMar>
+              <w:top w:type="dxa" w:w="70"/>
+              <w:left w:type="dxa" w:w="110"/>
+              <w:bottom w:type="dxa" w:w="70"/>
+              <w:right w:type="dxa" w:w="110"/>
+            </w:tcMar>
+          </w:tcPr>
+          <w:p>
+            <w:pPr>
+              <w:spacing w:after="0"/>
+            </w:pPr>
+            <w:r>
+              <w:rPr>
+                <w:sz w:val="19"/>
+                <w:szCs w:val="19"/>
+              </w:rPr>
+              <w:t xml:space="preserve">Nilai tiap mapel, rata-rata mapel yang sudah dinilai, dan *Dinilai* (mis. 4/5). Merah = di bawah batas; </w:t>
+            </w:r>
+            <w:r>
+              <w:rPr>
+                <w:b/>
+                <w:bCs/>
+                <w:sz w:val="19"/>
+                <w:szCs w:val="19"/>
+              </w:rPr>
+              <w:t xml:space="preserve">TH</w:t>
+            </w:r>
+            <w:r>
+              <w:rPr>
+                <w:sz w:val="19"/>
+                <w:szCs w:val="19"/>
+              </w:rPr>
+              <w:t xml:space="preserve"> tidak hadir, </w:t>
+            </w:r>
+            <w:r>
+              <w:rPr>
+                <w:b/>
+                <w:bCs/>
+                <w:sz w:val="19"/>
+                <w:szCs w:val="19"/>
+              </w:rPr>
+              <w:t xml:space="preserve">BL</w:t>
+            </w:r>
+            <w:r>
+              <w:rPr>
+                <w:sz w:val="19"/>
+                <w:szCs w:val="19"/>
+              </w:rPr>
+              <w:t xml:space="preserve"> belum mengerjakan, </w:t>
+            </w:r>
+            <w:r>
+              <w:rPr>
+                <w:b/>
+                <w:bCs/>
+                <w:sz w:val="19"/>
+                <w:szCs w:val="19"/>
+              </w:rPr>
+              <w:t xml:space="preserve">JD</w:t>
+            </w:r>
+            <w:r>
+              <w:rPr>
+                <w:sz w:val="19"/>
+                <w:szCs w:val="19"/>
+              </w:rPr>
+              <w:t xml:space="preserve"> terjadwal, </w:t>
+            </w:r>
+            <w:r>
+              <w:rPr>
+                <w:b/>
+                <w:bCs/>
+                <w:sz w:val="19"/>
+                <w:szCs w:val="19"/>
+              </w:rPr>
+              <w:t xml:space="preserve">·</w:t>
+            </w:r>
+            <w:r>
+              <w:rPr>
+                <w:sz w:val="19"/>
+                <w:szCs w:val="19"/>
+              </w:rPr>
+              <w:t xml:space="preserve"> siswa tidak punya mapel itu, </w:t>
+            </w:r>
+            <w:r>
+              <w:rPr>
+                <w:b/>
+                <w:bCs/>
+                <w:sz w:val="19"/>
+                <w:szCs w:val="19"/>
+              </w:rPr>
+              <w:t xml:space="preserve">s</w:t>
+            </w:r>
+            <w:r>
+              <w:rPr>
+                <w:sz w:val="19"/>
+                <w:szCs w:val="19"/>
+              </w:rPr>
+              <w:t xml:space="preserve"> kecil = susulan.</w:t>
+            </w:r>
+          </w:p>
+        </w:tc>
+      </w:tr>
+      <w:tr>
+        <w:trPr>
+          <w:cantSplit/>
+        </w:trPr>
+        <w:tc>
+          <w:tcPr>
+            <w:tcW w:type="dxa" w:w="2754"/>
+            <w:shd w:fill="F6F8FB" w:color="auto" w:val="clear"/>
+            <w:tcMar>
+              <w:top w:type="dxa" w:w="70"/>
+              <w:left w:type="dxa" w:w="110"/>
+              <w:bottom w:type="dxa" w:w="70"/>
+              <w:right w:type="dxa" w:w="110"/>
+            </w:tcMar>
+          </w:tcPr>
+          <w:p>
+            <w:pPr>
+              <w:spacing w:after="0"/>
+            </w:pPr>
+            <w:r>
+              <w:rPr>
+                <w:b/>
+                <w:bCs/>
+                <w:sz w:val="19"/>
+                <w:szCs w:val="19"/>
+              </w:rPr>
+              <w:t xml:space="preserve">Unduh Excel</w:t>
+            </w:r>
+          </w:p>
+        </w:tc>
+        <w:tc>
+          <w:tcPr>
+            <w:tcW w:type="dxa" w:w="6884"/>
+            <w:shd w:fill="F6F8FB" w:color="auto" w:val="clear"/>
+            <w:tcMar>
+              <w:top w:type="dxa" w:w="70"/>
+              <w:left w:type="dxa" w:w="110"/>
+              <w:bottom w:type="dxa" w:w="70"/>
+              <w:right w:type="dxa" w:w="110"/>
+            </w:tcMar>
+          </w:tcPr>
+          <w:p>
+            <w:pPr>
+              <w:spacing w:after="0"/>
+            </w:pPr>
+            <w:r>
+              <w:rPr>
+                <w:sz w:val="19"/>
+                <w:szCs w:val="19"/>
+              </w:rPr>
+              <w:t xml:space="preserve">Tiga lembar: Nilai per siswa, Per mapel, Per kelas. Mengikuti pilihan Kelas (pilih satu kelas untuk berkas wali kelas).</w:t>
+            </w:r>
+          </w:p>
+        </w:tc>
+      </w:tr>
+    </w:tbl>
+    <w:p>
+      <w:pPr>
+        <w:spacing w:after="120"/>
+      </w:pPr>
+    </w:p>
+    <w:tbl>
+      <w:tblPr>
+        <w:tblW w:type="dxa" w:w="9638"/>
+        <w:tblBorders>
+          <w:top w:val="none" w:color="FFFFFF" w:sz="0"/>
+          <w:left w:val="single" w:color="2F7FD8" w:sz="30"/>
+          <w:bottom w:val="none" w:color="FFFFFF" w:sz="0"/>
+          <w:right w:val="none" w:color="FFFFFF" w:sz="0"/>
+          <w:insideH w:val="none" w:color="FFFFFF" w:sz="0"/>
+          <w:insideV w:val="none" w:color="FFFFFF" w:sz="0"/>
+        </w:tblBorders>
+      </w:tblPr>
+      <w:tblGrid>
+        <w:gridCol w:w="9638"/>
+      </w:tblGrid>
+      <w:tr>
+        <w:trPr>
+          <w:cantSplit/>
+        </w:trPr>
+        <w:tc>
+          <w:tcPr>
+            <w:tcW w:type="dxa" w:w="9638"/>
+            <w:shd w:fill="E8F1FC" w:color="auto" w:val="clear"/>
+            <w:tcMar>
+              <w:top w:type="dxa" w:w="120"/>
+              <w:left w:type="dxa" w:w="200"/>
+              <w:bottom w:type="dxa" w:w="120"/>
+              <w:right w:type="dxa" w:w="160"/>
+            </w:tcMar>
+          </w:tcPr>
+          <w:p>
+            <w:pPr>
+              <w:spacing w:after="40"/>
+            </w:pPr>
+            <w:r>
+              <w:rPr>
+                <w:b/>
+                <w:bCs/>
+                <w:color w:val="2F7FD8"/>
+                <w:sz w:val="20"/>
+                <w:szCs w:val="20"/>
+              </w:rPr>
+              <w:t xml:space="preserve">Versi pertama</w:t>
+            </w:r>
+          </w:p>
+          <w:p>
+            <w:pPr>
+              <w:spacing w:after="40"/>
+            </w:pPr>
+            <w:r>
+              <w:rPr>
+                <w:sz w:val="19"/>
+                <w:szCs w:val="19"/>
+              </w:rPr>
+              <w:t xml:space="preserve">Bentuk rekap ini masih bisa berubah mengikuti masukan kurikulum (format rapor, KKM per mapel, peringkat).</w:t>
+            </w:r>
+          </w:p>
+        </w:tc>
+      </w:tr>
+    </w:tbl>
+    <w:p>
+      <w:pPr>
+        <w:spacing w:after="120"/>
+      </w:pPr>
+    </w:p>
+    <w:p>
+      <w:pPr>
+        <w:pStyle w:val="Heading2"/>
+      </w:pPr>
+      <w:r>
+        <w:t xml:space="preserve">5.3 Hasil Siswa</w:t>
       </w:r>
     </w:p>
     <w:p>

</xml_diff>

<commit_message>
Menu Kurikulum berkelompok (Pantauan, PAS, Kegiatan guru); operator tanpa Pantau/Tryout Umum; PAS tanpa PIN guru; panduan diperbarui
Co-Authored-By: Claude Opus 5.5 <noreply@anthropic.com>
</commit_message>
<xml_diff>
--- a/Panduan_Asesmen_Bersama.docx
+++ b/Panduan_Asesmen_Bersama.docx
@@ -847,7 +847,7 @@
                 <w:sz w:val="19"/>
                 <w:szCs w:val="19"/>
               </w:rPr>
-              <w:t xml:space="preserve">Operator / kurikulum</w:t>
+              <w:t xml:space="preserve">Kurikulum / operator</w:t>
             </w:r>
           </w:p>
         </w:tc>
@@ -870,7 +870,7 @@
                 <w:sz w:val="19"/>
                 <w:szCs w:val="19"/>
               </w:rPr>
-              <w:t xml:space="preserve">PIN operator</w:t>
+              <w:t xml:space="preserve">PIN kurikulum atau PIN operator</w:t>
             </w:r>
           </w:p>
         </w:tc>

</xml_diff>

<commit_message>
Panduan diselaraskan: peran kurikulum/operator, istilah sasaran, hasil Tryout Umum & PAS di Dasbor guru
Co-Authored-By: Claude Opus 5.5 <noreply@anthropic.com>
</commit_message>
<xml_diff>
--- a/Panduan_Asesmen_Bersama.docx
+++ b/Panduan_Asesmen_Bersama.docx
@@ -185,7 +185,7 @@
           <w:sz w:val="19"/>
           <w:szCs w:val="19"/>
         </w:rPr>
-        <w:t xml:space="preserve">Untuk: operator/kurikulum dan pengawas ruang</w:t>
+        <w:t xml:space="preserve">Untuk: kurikulum, operator, dan pengawas ruang</w:t>
       </w:r>
     </w:p>
     <w:p>
@@ -1559,7 +1559,7 @@
         <w:spacing w:after="120"/>
       </w:pPr>
       <w:r>
-        <w:t xml:space="preserve">Masuk dengan PIN operator, buka </w:t>
+        <w:t xml:space="preserve">Masuk dengan PIN kurikulum atau PIN operator, buka </w:t>
       </w:r>
       <w:r>
         <w:rPr>

</xml_diff>